<commit_message>
Implement faculties table in schema and enhance admin functionality. Add faculty management API endpoints for creating, listing, updating, and deleting faculties. Update the sidebar navigation and adjust components to reflect new faculty management features. Refactor overview and leads report components to utilize updated data structures.
</commit_message>
<xml_diff>
--- a/public/studentsfinalforms/Form 1 Thesis form Other than Medical Sciences.docx
+++ b/public/studentsfinalforms/Form 1 Thesis form Other than Medical Sciences.docx
@@ -1,6 +1,6 @@
 
 <file path=word/document.xml><?xml version="1.0" encoding="utf-8"?>
-<w:document xmlns:wpc="http://schemas.microsoft.com/office/word/2010/wordprocessingCanvas" xmlns:cx="http://schemas.microsoft.com/office/drawing/2014/chartex" xmlns:cx1="http://schemas.microsoft.com/office/drawing/2015/9/8/chartex" xmlns:cx2="http://schemas.microsoft.com/office/drawing/2015/10/21/chartex" xmlns:cx3="http://schemas.microsoft.com/office/drawing/2016/5/9/chartex" xmlns:cx4="http://schemas.microsoft.com/office/drawing/2016/5/10/chartex" xmlns:cx5="http://schemas.microsoft.com/office/drawing/2016/5/11/chartex" xmlns:cx6="http://schemas.microsoft.com/office/drawing/2016/5/12/chartex" xmlns:cx7="http://schemas.microsoft.com/office/drawing/2016/5/13/chartex" xmlns:cx8="http://schemas.microsoft.com/office/drawing/2016/5/14/chartex" xmlns:mc="http://schemas.openxmlformats.org/markup-compatibility/2006" xmlns:aink="http://schemas.microsoft.com/office/drawing/2016/ink" xmlns:am3d="http://schemas.microsoft.com/office/drawing/2017/model3d" xmlns:o="urn:schemas-microsoft-com:office:office" xmlns:r="http://schemas.openxmlformats.org/officeDocument/2006/relationships" xmlns:m="http://schemas.openxmlformats.org/officeDocument/2006/math" xmlns:v="urn:schemas-microsoft-com:vml" xmlns:wp14="http://schemas.microsoft.com/office/word/2010/wordprocessingDrawing" xmlns:wp="http://schemas.openxmlformats.org/drawingml/2006/wordprocessingDrawing" xmlns:w10="urn:schemas-microsoft-com:office:word" xmlns:w="http://schemas.openxmlformats.org/wordprocessingml/2006/main" xmlns:w14="http://schemas.microsoft.com/office/word/2010/wordml" xmlns:w15="http://schemas.microsoft.com/office/word/2012/wordml" xmlns:w16cex="http://schemas.microsoft.com/office/word/2018/wordml/cex" xmlns:w16cid="http://schemas.microsoft.com/office/word/2016/wordml/cid" xmlns:w16="http://schemas.microsoft.com/office/word/2018/wordml" xmlns:w16sdtdh="http://schemas.microsoft.com/office/word/2020/wordml/sdtdatahash" xmlns:w16se="http://schemas.microsoft.com/office/word/2015/wordml/symex" xmlns:wpg="http://schemas.microsoft.com/office/word/2010/wordprocessingGroup" xmlns:wpi="http://schemas.microsoft.com/office/word/2010/wordprocessingInk" xmlns:wne="http://schemas.microsoft.com/office/word/2006/wordml" xmlns:wps="http://schemas.microsoft.com/office/word/2010/wordprocessingShape" mc:Ignorable="w14 w15 w16se w16cid w16 w16cex w16sdtdh wp14">
+<w:document xmlns:wpc="http://schemas.microsoft.com/office/word/2010/wordprocessingCanvas" xmlns:cx="http://schemas.microsoft.com/office/drawing/2014/chartex" xmlns:cx1="http://schemas.microsoft.com/office/drawing/2015/9/8/chartex" xmlns:cx2="http://schemas.microsoft.com/office/drawing/2015/10/21/chartex" xmlns:cx3="http://schemas.microsoft.com/office/drawing/2016/5/9/chartex" xmlns:cx4="http://schemas.microsoft.com/office/drawing/2016/5/10/chartex" xmlns:cx5="http://schemas.microsoft.com/office/drawing/2016/5/11/chartex" xmlns:cx6="http://schemas.microsoft.com/office/drawing/2016/5/12/chartex" xmlns:cx7="http://schemas.microsoft.com/office/drawing/2016/5/13/chartex" xmlns:cx8="http://schemas.microsoft.com/office/drawing/2016/5/14/chartex" xmlns:mc="http://schemas.openxmlformats.org/markup-compatibility/2006" xmlns:aink="http://schemas.microsoft.com/office/drawing/2016/ink" xmlns:am3d="http://schemas.microsoft.com/office/drawing/2017/model3d" xmlns:o="urn:schemas-microsoft-com:office:office" xmlns:oel="http://schemas.microsoft.com/office/2019/extlst" xmlns:r="http://schemas.openxmlformats.org/officeDocument/2006/relationships" xmlns:m="http://schemas.openxmlformats.org/officeDocument/2006/math" xmlns:v="urn:schemas-microsoft-com:vml" xmlns:wp14="http://schemas.microsoft.com/office/word/2010/wordprocessingDrawing" xmlns:wp="http://schemas.openxmlformats.org/drawingml/2006/wordprocessingDrawing" xmlns:w10="urn:schemas-microsoft-com:office:word" xmlns:w="http://schemas.openxmlformats.org/wordprocessingml/2006/main" xmlns:w14="http://schemas.microsoft.com/office/word/2010/wordml" xmlns:w15="http://schemas.microsoft.com/office/word/2012/wordml" xmlns:w16cex="http://schemas.microsoft.com/office/word/2018/wordml/cex" xmlns:w16cid="http://schemas.microsoft.com/office/word/2016/wordml/cid" xmlns:w16="http://schemas.microsoft.com/office/word/2018/wordml" xmlns:w16du="http://schemas.microsoft.com/office/word/2023/wordml/word16du" xmlns:w16sdtdh="http://schemas.microsoft.com/office/word/2020/wordml/sdtdatahash" xmlns:w16sdtfl="http://schemas.microsoft.com/office/word/2024/wordml/sdtformatlock" xmlns:w16se="http://schemas.microsoft.com/office/word/2015/wordml/symex" xmlns:wpg="http://schemas.microsoft.com/office/word/2010/wordprocessingGroup" xmlns:wpi="http://schemas.microsoft.com/office/word/2010/wordprocessingInk" xmlns:wne="http://schemas.microsoft.com/office/word/2006/wordml" xmlns:wps="http://schemas.microsoft.com/office/word/2010/wordprocessingShape" mc:Ignorable="w14 w15 w16se w16cid w16 w16cex w16sdtdh w16sdtfl w16du wp14">
   <w:body>
     <w:p>
       <w:pPr>
@@ -96,6 +96,14 @@
               </w:rPr>
               <w:t>Scholar’s Name</w:t>
             </w:r>
+            <w:r>
+              <w:rPr>
+                <w:rFonts w:ascii="Times New Roman" w:hAnsi="Times New Roman" w:cs="Times New Roman"/>
+                <w:sz w:val="24"/>
+                <w:szCs w:val="24"/>
+              </w:rPr>
+              <w:t>(logged in user)</w:t>
+            </w:r>
           </w:p>
         </w:tc>
         <w:tc>
@@ -117,6 +125,14 @@
                 <w:szCs w:val="24"/>
               </w:rPr>
               <w:t xml:space="preserve">Auto fetch </w:t>
+            </w:r>
+            <w:r>
+              <w:rPr>
+                <w:rFonts w:ascii="Times New Roman" w:hAnsi="Times New Roman" w:cs="Times New Roman"/>
+                <w:sz w:val="24"/>
+                <w:szCs w:val="24"/>
+              </w:rPr>
+              <w:t>(from sap login)</w:t>
             </w:r>
           </w:p>
         </w:tc>
@@ -169,6 +185,14 @@
                 <w:szCs w:val="24"/>
               </w:rPr>
               <w:t xml:space="preserve">Auto fetch </w:t>
+            </w:r>
+            <w:r>
+              <w:rPr>
+                <w:rFonts w:ascii="Times New Roman" w:hAnsi="Times New Roman" w:cs="Times New Roman"/>
+                <w:sz w:val="24"/>
+                <w:szCs w:val="24"/>
+              </w:rPr>
+              <w:t>(from sap login)</w:t>
             </w:r>
           </w:p>
         </w:tc>
@@ -448,14 +472,6 @@
                 <w:szCs w:val="24"/>
               </w:rPr>
             </w:pPr>
-            <w:r>
-              <w:rPr>
-                <w:rFonts w:ascii="Times New Roman" w:hAnsi="Times New Roman" w:cs="Times New Roman"/>
-                <w:sz w:val="24"/>
-                <w:szCs w:val="24"/>
-              </w:rPr>
-              <w:t xml:space="preserve">Auto fetch from SAP database </w:t>
-            </w:r>
           </w:p>
         </w:tc>
       </w:tr>
@@ -544,14 +560,6 @@
                 <w:szCs w:val="24"/>
               </w:rPr>
             </w:pPr>
-            <w:r>
-              <w:rPr>
-                <w:rFonts w:ascii="Times New Roman" w:hAnsi="Times New Roman" w:cs="Times New Roman"/>
-                <w:sz w:val="24"/>
-                <w:szCs w:val="24"/>
-              </w:rPr>
-              <w:t xml:space="preserve">Auto fetch from SAP database </w:t>
-            </w:r>
           </w:p>
         </w:tc>
       </w:tr>
@@ -594,14 +602,6 @@
                 <w:szCs w:val="24"/>
               </w:rPr>
             </w:pPr>
-            <w:r>
-              <w:rPr>
-                <w:rFonts w:ascii="Times New Roman" w:hAnsi="Times New Roman" w:cs="Times New Roman"/>
-                <w:sz w:val="24"/>
-                <w:szCs w:val="24"/>
-              </w:rPr>
-              <w:t xml:space="preserve">Auto fetch from SAP database </w:t>
-            </w:r>
           </w:p>
         </w:tc>
       </w:tr>
@@ -644,14 +644,6 @@
                 <w:szCs w:val="24"/>
               </w:rPr>
             </w:pPr>
-            <w:r>
-              <w:rPr>
-                <w:rFonts w:ascii="Times New Roman" w:hAnsi="Times New Roman" w:cs="Times New Roman"/>
-                <w:sz w:val="24"/>
-                <w:szCs w:val="24"/>
-              </w:rPr>
-              <w:t xml:space="preserve">Auto fetch from SAP database </w:t>
-            </w:r>
           </w:p>
         </w:tc>
       </w:tr>
@@ -769,14 +761,6 @@
                 <w:szCs w:val="24"/>
               </w:rPr>
             </w:pPr>
-            <w:r>
-              <w:rPr>
-                <w:rFonts w:ascii="Times New Roman" w:hAnsi="Times New Roman" w:cs="Times New Roman"/>
-                <w:sz w:val="24"/>
-                <w:szCs w:val="24"/>
-              </w:rPr>
-              <w:t xml:space="preserve">Auto fetch from SAP database </w:t>
-            </w:r>
           </w:p>
         </w:tc>
       </w:tr>
@@ -865,14 +849,6 @@
                 <w:szCs w:val="24"/>
               </w:rPr>
             </w:pPr>
-            <w:r>
-              <w:rPr>
-                <w:rFonts w:ascii="Times New Roman" w:hAnsi="Times New Roman" w:cs="Times New Roman"/>
-                <w:sz w:val="24"/>
-                <w:szCs w:val="24"/>
-              </w:rPr>
-              <w:t xml:space="preserve">Auto fetch from SAP database </w:t>
-            </w:r>
           </w:p>
         </w:tc>
       </w:tr>
@@ -915,14 +891,6 @@
                 <w:szCs w:val="24"/>
               </w:rPr>
             </w:pPr>
-            <w:r>
-              <w:rPr>
-                <w:rFonts w:ascii="Times New Roman" w:hAnsi="Times New Roman" w:cs="Times New Roman"/>
-                <w:sz w:val="24"/>
-                <w:szCs w:val="24"/>
-              </w:rPr>
-              <w:t xml:space="preserve">Auto fetch from SAP database </w:t>
-            </w:r>
           </w:p>
         </w:tc>
       </w:tr>
@@ -965,14 +933,6 @@
                 <w:szCs w:val="24"/>
               </w:rPr>
             </w:pPr>
-            <w:r>
-              <w:rPr>
-                <w:rFonts w:ascii="Times New Roman" w:hAnsi="Times New Roman" w:cs="Times New Roman"/>
-                <w:sz w:val="24"/>
-                <w:szCs w:val="24"/>
-              </w:rPr>
-              <w:t xml:space="preserve">Auto fetch from SAP database </w:t>
-            </w:r>
           </w:p>
         </w:tc>
       </w:tr>
@@ -1370,7 +1330,7 @@
               </wp:anchor>
             </w:drawing>
           </mc:Choice>
-          <mc:Fallback xmlns:w16sdtfl="http://schemas.microsoft.com/office/word/2024/wordml/sdtformatlock" xmlns:w16du="http://schemas.microsoft.com/office/word/2023/wordml/word16du" xmlns:oel="http://schemas.microsoft.com/office/2019/extlst">
+          <mc:Fallback>
             <w:pict>
               <v:line w14:anchorId="2446089D" id="Straight Connector 2" o:spid="_x0000_s1026" style="position:absolute;z-index:251695104;visibility:visible;mso-wrap-style:square;mso-wrap-distance-left:9pt;mso-wrap-distance-top:0;mso-wrap-distance-right:9pt;mso-wrap-distance-bottom:0;mso-position-horizontal:absolute;mso-position-horizontal-relative:text;mso-position-vertical:absolute;mso-position-vertical-relative:text" from="120pt,9.75pt" to="343.5pt,10.5pt" o:gfxdata="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" strokecolor="black [3200]" strokeweight=".5pt">
                 <v:stroke joinstyle="miter"/>
@@ -1464,7 +1424,7 @@
               </wp:anchor>
             </w:drawing>
           </mc:Choice>
-          <mc:Fallback xmlns:w16sdtfl="http://schemas.microsoft.com/office/word/2024/wordml/sdtformatlock" xmlns:w16du="http://schemas.microsoft.com/office/word/2023/wordml/word16du" xmlns:oel="http://schemas.microsoft.com/office/2019/extlst">
+          <mc:Fallback>
             <w:pict>
               <v:line w14:anchorId="2AE1E164" id="Straight Connector 2" o:spid="_x0000_s1026" style="position:absolute;z-index:251697152;visibility:visible;mso-wrap-style:square;mso-wrap-distance-left:9pt;mso-wrap-distance-top:0;mso-wrap-distance-right:9pt;mso-wrap-distance-bottom:0;mso-position-horizontal:absolute;mso-position-horizontal-relative:text;mso-position-vertical:absolute;mso-position-vertical-relative:text" from="120.75pt,6pt" to="344.25pt,6.75pt" o:gfxdata="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" strokecolor="black [3200]" strokeweight=".5pt">
                 <v:stroke joinstyle="miter"/>
@@ -1561,7 +1521,7 @@
               </wp:anchor>
             </w:drawing>
           </mc:Choice>
-          <mc:Fallback xmlns:w16sdtfl="http://schemas.microsoft.com/office/word/2024/wordml/sdtformatlock" xmlns:w16du="http://schemas.microsoft.com/office/word/2023/wordml/word16du" xmlns:oel="http://schemas.microsoft.com/office/2019/extlst">
+          <mc:Fallback>
             <w:pict>
               <v:line w14:anchorId="4A5E0028" id="Straight Connector 2" o:spid="_x0000_s1026" style="position:absolute;z-index:251699200;visibility:visible;mso-wrap-style:square;mso-wrap-distance-left:9pt;mso-wrap-distance-top:0;mso-wrap-distance-right:9pt;mso-wrap-distance-bottom:0;mso-position-horizontal:absolute;mso-position-horizontal-relative:text;mso-position-vertical:absolute;mso-position-vertical-relative:text" from="120pt,8.95pt" to="343.5pt,9.7pt" o:gfxdata="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" strokecolor="black [3200]" strokeweight=".5pt">
                 <v:stroke joinstyle="miter"/>
@@ -1638,7 +1598,7 @@
               </wp:anchor>
             </w:drawing>
           </mc:Choice>
-          <mc:Fallback xmlns:w16sdtfl="http://schemas.microsoft.com/office/word/2024/wordml/sdtformatlock" xmlns:w16du="http://schemas.microsoft.com/office/word/2023/wordml/word16du" xmlns:oel="http://schemas.microsoft.com/office/2019/extlst">
+          <mc:Fallback>
             <w:pict>
               <v:line w14:anchorId="3ED99D19" id="Straight Connector 2" o:spid="_x0000_s1026" style="position:absolute;z-index:251658261;visibility:visible;mso-wrap-style:square;mso-wrap-distance-left:9pt;mso-wrap-distance-top:0;mso-wrap-distance-right:9pt;mso-wrap-distance-bottom:0;mso-position-horizontal:absolute;mso-position-horizontal-relative:text;mso-position-vertical:absolute;mso-position-vertical-relative:text" from="129.95pt,12.7pt" to="353.45pt,13.45pt" o:gfxdata="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" strokecolor="black [3200]" strokeweight=".5pt">
                 <v:stroke joinstyle="miter"/>
@@ -1896,14 +1856,7 @@
           <w:i/>
           <w:iCs/>
         </w:rPr>
-        <w:t xml:space="preserve">, </w:t>
-      </w:r>
-      <w:r>
-        <w:rPr>
-          <w:i/>
-          <w:iCs/>
-        </w:rPr>
-        <w:t>Multiple select option</w:t>
+        <w:t>, Multiple select option</w:t>
       </w:r>
       <w:r>
         <w:rPr>
@@ -2298,7 +2251,7 @@
               </wp:anchor>
             </w:drawing>
           </mc:Choice>
-          <mc:Fallback xmlns:w16sdtfl="http://schemas.microsoft.com/office/word/2024/wordml/sdtformatlock" xmlns:w16du="http://schemas.microsoft.com/office/word/2023/wordml/word16du" xmlns:oel="http://schemas.microsoft.com/office/2019/extlst">
+          <mc:Fallback>
             <w:pict>
               <v:line w14:anchorId="639F2B5E" id="Straight Connector 2" o:spid="_x0000_s1026" style="position:absolute;z-index:251658262;visibility:visible;mso-wrap-style:square;mso-width-percent:0;mso-height-percent:0;mso-wrap-distance-left:9pt;mso-wrap-distance-top:0;mso-wrap-distance-right:9pt;mso-wrap-distance-bottom:0;mso-position-horizontal:absolute;mso-position-horizontal-relative:text;mso-position-vertical:absolute;mso-position-vertical-relative:text;mso-width-percent:0;mso-height-percent:0;mso-width-relative:margin;mso-height-relative:margin" from="273.8pt,12.8pt" to="449.7pt,12.8pt" o:gfxdata="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" strokecolor="black [3200]" strokeweight=".5pt">
                 <v:stroke joinstyle="miter"/>
@@ -2567,23 +2520,7 @@
           <w:i/>
           <w:iCs/>
         </w:rPr>
-        <w:t xml:space="preserve">If </w:t>
-      </w:r>
-      <w:proofErr w:type="gramStart"/>
-      <w:r>
-        <w:rPr>
-          <w:i/>
-          <w:iCs/>
-        </w:rPr>
-        <w:t>Yes</w:t>
-      </w:r>
-      <w:proofErr w:type="gramEnd"/>
-      <w:r>
-        <w:rPr>
-          <w:i/>
-          <w:iCs/>
-        </w:rPr>
-        <w:t>, specify the type(s):</w:t>
+        <w:t>If Yes, specify the type(s):</w:t>
       </w:r>
       <w:r>
         <w:br/>
@@ -2756,19 +2693,11 @@
       <w:r>
         <w:t xml:space="preserve"> </w:t>
       </w:r>
-      <w:proofErr w:type="gramStart"/>
-      <w:r>
-        <w:rPr>
-          <w:iCs/>
-        </w:rPr>
-        <w:t>Social Media</w:t>
-      </w:r>
-      <w:proofErr w:type="gramEnd"/>
-      <w:r>
-        <w:rPr>
-          <w:iCs/>
-        </w:rPr>
-        <w:t xml:space="preserve"> (Facebook, Instagram, etc.) </w:t>
+      <w:r>
+        <w:rPr>
+          <w:iCs/>
+        </w:rPr>
+        <w:t xml:space="preserve">Social Media (Facebook, Instagram, etc.) </w:t>
       </w:r>
       <w:r>
         <w:rPr>
@@ -3443,7 +3372,7 @@
               </wp:anchor>
             </w:drawing>
           </mc:Choice>
-          <mc:Fallback xmlns:w16sdtfl="http://schemas.microsoft.com/office/word/2024/wordml/sdtformatlock" xmlns:w16du="http://schemas.microsoft.com/office/word/2023/wordml/word16du" xmlns:oel="http://schemas.microsoft.com/office/2019/extlst">
+          <mc:Fallback>
             <w:pict>
               <v:rect w14:anchorId="3212D12F" id="Rectangle 1" o:spid="_x0000_s1026" style="position:absolute;margin-left:0;margin-top:0;width:433.5pt;height:50.25pt;z-index:251661312;visibility:visible;mso-wrap-style:square;mso-wrap-distance-left:9pt;mso-wrap-distance-top:0;mso-wrap-distance-right:9pt;mso-wrap-distance-bottom:0;mso-position-horizontal:absolute;mso-position-horizontal-relative:text;mso-position-vertical:absolute;mso-position-vertical-relative:text;v-text-anchor:middle" o:gfxdata="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" filled="f" strokecolor="black [3213]" strokeweight="1pt"/>
             </w:pict>
@@ -3830,7 +3759,7 @@
               </wp:anchor>
             </w:drawing>
           </mc:Choice>
-          <mc:Fallback xmlns:w16sdtfl="http://schemas.microsoft.com/office/word/2024/wordml/sdtformatlock" xmlns:w16du="http://schemas.microsoft.com/office/word/2023/wordml/word16du" xmlns:oel="http://schemas.microsoft.com/office/2019/extlst">
+          <mc:Fallback>
             <w:pict>
               <v:rect w14:anchorId="71560282" id="Rectangle 1" o:spid="_x0000_s1026" style="position:absolute;margin-left:0;margin-top:-.05pt;width:433.5pt;height:50.25pt;z-index:251664407;visibility:visible;mso-wrap-style:square;mso-wrap-distance-left:9pt;mso-wrap-distance-top:0;mso-wrap-distance-right:9pt;mso-wrap-distance-bottom:0;mso-position-horizontal:absolute;mso-position-horizontal-relative:text;mso-position-vertical:absolute;mso-position-vertical-relative:text;v-text-anchor:middle" o:gfxdata="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" filled="f" strokecolor="black [3213]" strokeweight="1pt"/>
             </w:pict>
@@ -4057,7 +3986,7 @@
               </wp:anchor>
             </w:drawing>
           </mc:Choice>
-          <mc:Fallback xmlns:w16sdtfl="http://schemas.microsoft.com/office/word/2024/wordml/sdtformatlock" xmlns:w16du="http://schemas.microsoft.com/office/word/2023/wordml/word16du" xmlns:oel="http://schemas.microsoft.com/office/2019/extlst">
+          <mc:Fallback>
             <w:pict>
               <v:rect w14:anchorId="7B62361D" id="Rectangle 1" o:spid="_x0000_s1026" style="position:absolute;margin-left:0;margin-top:-.05pt;width:433.5pt;height:50.25pt;z-index:251668503;visibility:visible;mso-wrap-style:square;mso-wrap-distance-left:9pt;mso-wrap-distance-top:0;mso-wrap-distance-right:9pt;mso-wrap-distance-bottom:0;mso-position-horizontal:absolute;mso-position-horizontal-relative:text;mso-position-vertical:absolute;mso-position-vertical-relative:text;v-text-anchor:middle" o:gfxdata="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" filled="f" strokecolor="black [3213]" strokeweight="1pt"/>
             </w:pict>
@@ -4695,7 +4624,7 @@
               </wp:anchor>
             </w:drawing>
           </mc:Choice>
-          <mc:Fallback xmlns:w16sdtfl="http://schemas.microsoft.com/office/word/2024/wordml/sdtformatlock" xmlns:w16du="http://schemas.microsoft.com/office/word/2023/wordml/word16du" xmlns:oel="http://schemas.microsoft.com/office/2019/extlst">
+          <mc:Fallback>
             <w:pict>
               <v:rect w14:anchorId="271A8DB7" id="Rectangle 1" o:spid="_x0000_s1026" style="position:absolute;margin-left:0;margin-top:0;width:470.5pt;height:54.4pt;z-index:251666455;visibility:visible;mso-wrap-style:square;mso-wrap-distance-left:9pt;mso-wrap-distance-top:0;mso-wrap-distance-right:9pt;mso-wrap-distance-bottom:0;mso-position-horizontal:absolute;mso-position-horizontal-relative:text;mso-position-vertical:absolute;mso-position-vertical-relative:text;v-text-anchor:middle" o:gfxdata="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" filled="f" strokecolor="#09101d [484]" strokeweight="1pt"/>
             </w:pict>
@@ -5008,7 +4937,6 @@
       <w:pPr>
         <w:jc w:val="both"/>
       </w:pPr>
-      <w:proofErr w:type="gramStart"/>
       <w:r>
         <w:rPr>
           <w:rFonts w:ascii="Segoe UI Symbol" w:hAnsi="Segoe UI Symbol" w:cs="Segoe UI Symbol"/>
@@ -5019,11 +4947,7 @@
         <w:t xml:space="preserve">  </w:t>
       </w:r>
       <w:r>
-        <w:t>I</w:t>
-      </w:r>
-      <w:proofErr w:type="gramEnd"/>
-      <w:r>
-        <w:t xml:space="preserve">/We ______________________ hereby certify that: </w:t>
+        <w:t xml:space="preserve">I/We ______________________ hereby certify that: </w:t>
       </w:r>
       <w:r>
         <w:t xml:space="preserve"> I have provided accurate and complete information in this application. I understand the ethical principles and requirements for conducting research with human subjects. I will conduct this research in accordance with approved protocols and ethical guidelines. I will report any adverse events or protocol deviations immediately to my supervisor and the </w:t>
@@ -5075,7 +4999,7 @@
 </file>
 
 <file path=word/endnotes.xml><?xml version="1.0" encoding="utf-8"?>
-<w:endnotes xmlns:wpc="http://schemas.microsoft.com/office/word/2010/wordprocessingCanvas" xmlns:cx="http://schemas.microsoft.com/office/drawing/2014/chartex" xmlns:cx1="http://schemas.microsoft.com/office/drawing/2015/9/8/chartex" xmlns:cx2="http://schemas.microsoft.com/office/drawing/2015/10/21/chartex" xmlns:cx3="http://schemas.microsoft.com/office/drawing/2016/5/9/chartex" xmlns:cx4="http://schemas.microsoft.com/office/drawing/2016/5/10/chartex" xmlns:cx5="http://schemas.microsoft.com/office/drawing/2016/5/11/chartex" xmlns:cx6="http://schemas.microsoft.com/office/drawing/2016/5/12/chartex" xmlns:cx7="http://schemas.microsoft.com/office/drawing/2016/5/13/chartex" xmlns:cx8="http://schemas.microsoft.com/office/drawing/2016/5/14/chartex" xmlns:mc="http://schemas.openxmlformats.org/markup-compatibility/2006" xmlns:aink="http://schemas.microsoft.com/office/drawing/2016/ink" xmlns:am3d="http://schemas.microsoft.com/office/drawing/2017/model3d" xmlns:o="urn:schemas-microsoft-com:office:office" xmlns:r="http://schemas.openxmlformats.org/officeDocument/2006/relationships" xmlns:m="http://schemas.openxmlformats.org/officeDocument/2006/math" xmlns:v="urn:schemas-microsoft-com:vml" xmlns:wp14="http://schemas.microsoft.com/office/word/2010/wordprocessingDrawing" xmlns:wp="http://schemas.openxmlformats.org/drawingml/2006/wordprocessingDrawing" xmlns:w10="urn:schemas-microsoft-com:office:word" xmlns:w="http://schemas.openxmlformats.org/wordprocessingml/2006/main" xmlns:w14="http://schemas.microsoft.com/office/word/2010/wordml" xmlns:w15="http://schemas.microsoft.com/office/word/2012/wordml" xmlns:w16cex="http://schemas.microsoft.com/office/word/2018/wordml/cex" xmlns:w16cid="http://schemas.microsoft.com/office/word/2016/wordml/cid" xmlns:w16="http://schemas.microsoft.com/office/word/2018/wordml" xmlns:w16sdtdh="http://schemas.microsoft.com/office/word/2020/wordml/sdtdatahash" xmlns:w16se="http://schemas.microsoft.com/office/word/2015/wordml/symex" xmlns:wpg="http://schemas.microsoft.com/office/word/2010/wordprocessingGroup" xmlns:wpi="http://schemas.microsoft.com/office/word/2010/wordprocessingInk" xmlns:wne="http://schemas.microsoft.com/office/word/2006/wordml" xmlns:wps="http://schemas.microsoft.com/office/word/2010/wordprocessingShape" mc:Ignorable="w14 w15 w16se w16cid w16 w16cex w16sdtdh wp14">
+<w:endnotes xmlns:wpc="http://schemas.microsoft.com/office/word/2010/wordprocessingCanvas" xmlns:cx="http://schemas.microsoft.com/office/drawing/2014/chartex" xmlns:cx1="http://schemas.microsoft.com/office/drawing/2015/9/8/chartex" xmlns:cx2="http://schemas.microsoft.com/office/drawing/2015/10/21/chartex" xmlns:cx3="http://schemas.microsoft.com/office/drawing/2016/5/9/chartex" xmlns:cx4="http://schemas.microsoft.com/office/drawing/2016/5/10/chartex" xmlns:cx5="http://schemas.microsoft.com/office/drawing/2016/5/11/chartex" xmlns:cx6="http://schemas.microsoft.com/office/drawing/2016/5/12/chartex" xmlns:cx7="http://schemas.microsoft.com/office/drawing/2016/5/13/chartex" xmlns:cx8="http://schemas.microsoft.com/office/drawing/2016/5/14/chartex" xmlns:mc="http://schemas.openxmlformats.org/markup-compatibility/2006" xmlns:aink="http://schemas.microsoft.com/office/drawing/2016/ink" xmlns:am3d="http://schemas.microsoft.com/office/drawing/2017/model3d" xmlns:o="urn:schemas-microsoft-com:office:office" xmlns:oel="http://schemas.microsoft.com/office/2019/extlst" xmlns:r="http://schemas.openxmlformats.org/officeDocument/2006/relationships" xmlns:m="http://schemas.openxmlformats.org/officeDocument/2006/math" xmlns:v="urn:schemas-microsoft-com:vml" xmlns:wp14="http://schemas.microsoft.com/office/word/2010/wordprocessingDrawing" xmlns:wp="http://schemas.openxmlformats.org/drawingml/2006/wordprocessingDrawing" xmlns:w10="urn:schemas-microsoft-com:office:word" xmlns:w="http://schemas.openxmlformats.org/wordprocessingml/2006/main" xmlns:w14="http://schemas.microsoft.com/office/word/2010/wordml" xmlns:w15="http://schemas.microsoft.com/office/word/2012/wordml" xmlns:w16cex="http://schemas.microsoft.com/office/word/2018/wordml/cex" xmlns:w16cid="http://schemas.microsoft.com/office/word/2016/wordml/cid" xmlns:w16="http://schemas.microsoft.com/office/word/2018/wordml" xmlns:w16du="http://schemas.microsoft.com/office/word/2023/wordml/word16du" xmlns:w16sdtdh="http://schemas.microsoft.com/office/word/2020/wordml/sdtdatahash" xmlns:w16sdtfl="http://schemas.microsoft.com/office/word/2024/wordml/sdtformatlock" xmlns:w16se="http://schemas.microsoft.com/office/word/2015/wordml/symex" xmlns:wpg="http://schemas.microsoft.com/office/word/2010/wordprocessingGroup" xmlns:wpi="http://schemas.microsoft.com/office/word/2010/wordprocessingInk" xmlns:wne="http://schemas.microsoft.com/office/word/2006/wordml" xmlns:wps="http://schemas.microsoft.com/office/word/2010/wordprocessingShape" mc:Ignorable="w14 w15 w16se w16cid w16 w16cex w16sdtdh w16sdtfl w16du wp14">
   <w:endnote w:type="separator" w:id="-1">
     <w:p>
       <w:pPr>
@@ -5100,7 +5024,7 @@
 </file>
 
 <file path=word/footnotes.xml><?xml version="1.0" encoding="utf-8"?>
-<w:footnotes xmlns:wpc="http://schemas.microsoft.com/office/word/2010/wordprocessingCanvas" xmlns:cx="http://schemas.microsoft.com/office/drawing/2014/chartex" xmlns:cx1="http://schemas.microsoft.com/office/drawing/2015/9/8/chartex" xmlns:cx2="http://schemas.microsoft.com/office/drawing/2015/10/21/chartex" xmlns:cx3="http://schemas.microsoft.com/office/drawing/2016/5/9/chartex" xmlns:cx4="http://schemas.microsoft.com/office/drawing/2016/5/10/chartex" xmlns:cx5="http://schemas.microsoft.com/office/drawing/2016/5/11/chartex" xmlns:cx6="http://schemas.microsoft.com/office/drawing/2016/5/12/chartex" xmlns:cx7="http://schemas.microsoft.com/office/drawing/2016/5/13/chartex" xmlns:cx8="http://schemas.microsoft.com/office/drawing/2016/5/14/chartex" xmlns:mc="http://schemas.openxmlformats.org/markup-compatibility/2006" xmlns:aink="http://schemas.microsoft.com/office/drawing/2016/ink" xmlns:am3d="http://schemas.microsoft.com/office/drawing/2017/model3d" xmlns:o="urn:schemas-microsoft-com:office:office" xmlns:r="http://schemas.openxmlformats.org/officeDocument/2006/relationships" xmlns:m="http://schemas.openxmlformats.org/officeDocument/2006/math" xmlns:v="urn:schemas-microsoft-com:vml" xmlns:wp14="http://schemas.microsoft.com/office/word/2010/wordprocessingDrawing" xmlns:wp="http://schemas.openxmlformats.org/drawingml/2006/wordprocessingDrawing" xmlns:w10="urn:schemas-microsoft-com:office:word" xmlns:w="http://schemas.openxmlformats.org/wordprocessingml/2006/main" xmlns:w14="http://schemas.microsoft.com/office/word/2010/wordml" xmlns:w15="http://schemas.microsoft.com/office/word/2012/wordml" xmlns:w16cex="http://schemas.microsoft.com/office/word/2018/wordml/cex" xmlns:w16cid="http://schemas.microsoft.com/office/word/2016/wordml/cid" xmlns:w16="http://schemas.microsoft.com/office/word/2018/wordml" xmlns:w16sdtdh="http://schemas.microsoft.com/office/word/2020/wordml/sdtdatahash" xmlns:w16se="http://schemas.microsoft.com/office/word/2015/wordml/symex" xmlns:wpg="http://schemas.microsoft.com/office/word/2010/wordprocessingGroup" xmlns:wpi="http://schemas.microsoft.com/office/word/2010/wordprocessingInk" xmlns:wne="http://schemas.microsoft.com/office/word/2006/wordml" xmlns:wps="http://schemas.microsoft.com/office/word/2010/wordprocessingShape" mc:Ignorable="w14 w15 w16se w16cid w16 w16cex w16sdtdh wp14">
+<w:footnotes xmlns:wpc="http://schemas.microsoft.com/office/word/2010/wordprocessingCanvas" xmlns:cx="http://schemas.microsoft.com/office/drawing/2014/chartex" xmlns:cx1="http://schemas.microsoft.com/office/drawing/2015/9/8/chartex" xmlns:cx2="http://schemas.microsoft.com/office/drawing/2015/10/21/chartex" xmlns:cx3="http://schemas.microsoft.com/office/drawing/2016/5/9/chartex" xmlns:cx4="http://schemas.microsoft.com/office/drawing/2016/5/10/chartex" xmlns:cx5="http://schemas.microsoft.com/office/drawing/2016/5/11/chartex" xmlns:cx6="http://schemas.microsoft.com/office/drawing/2016/5/12/chartex" xmlns:cx7="http://schemas.microsoft.com/office/drawing/2016/5/13/chartex" xmlns:cx8="http://schemas.microsoft.com/office/drawing/2016/5/14/chartex" xmlns:mc="http://schemas.openxmlformats.org/markup-compatibility/2006" xmlns:aink="http://schemas.microsoft.com/office/drawing/2016/ink" xmlns:am3d="http://schemas.microsoft.com/office/drawing/2017/model3d" xmlns:o="urn:schemas-microsoft-com:office:office" xmlns:oel="http://schemas.microsoft.com/office/2019/extlst" xmlns:r="http://schemas.openxmlformats.org/officeDocument/2006/relationships" xmlns:m="http://schemas.openxmlformats.org/officeDocument/2006/math" xmlns:v="urn:schemas-microsoft-com:vml" xmlns:wp14="http://schemas.microsoft.com/office/word/2010/wordprocessingDrawing" xmlns:wp="http://schemas.openxmlformats.org/drawingml/2006/wordprocessingDrawing" xmlns:w10="urn:schemas-microsoft-com:office:word" xmlns:w="http://schemas.openxmlformats.org/wordprocessingml/2006/main" xmlns:w14="http://schemas.microsoft.com/office/word/2010/wordml" xmlns:w15="http://schemas.microsoft.com/office/word/2012/wordml" xmlns:w16cex="http://schemas.microsoft.com/office/word/2018/wordml/cex" xmlns:w16cid="http://schemas.microsoft.com/office/word/2016/wordml/cid" xmlns:w16="http://schemas.microsoft.com/office/word/2018/wordml" xmlns:w16du="http://schemas.microsoft.com/office/word/2023/wordml/word16du" xmlns:w16sdtdh="http://schemas.microsoft.com/office/word/2020/wordml/sdtdatahash" xmlns:w16sdtfl="http://schemas.microsoft.com/office/word/2024/wordml/sdtformatlock" xmlns:w16se="http://schemas.microsoft.com/office/word/2015/wordml/symex" xmlns:wpg="http://schemas.microsoft.com/office/word/2010/wordprocessingGroup" xmlns:wpi="http://schemas.microsoft.com/office/word/2010/wordprocessingInk" xmlns:wne="http://schemas.microsoft.com/office/word/2006/wordml" xmlns:wps="http://schemas.microsoft.com/office/word/2010/wordprocessingShape" mc:Ignorable="w14 w15 w16se w16cid w16 w16cex w16sdtdh w16sdtfl w16du wp14">
   <w:footnote w:type="separator" w:id="-1">
     <w:p>
       <w:pPr>
@@ -5125,7 +5049,7 @@
 </file>
 
 <file path=word/numbering.xml><?xml version="1.0" encoding="utf-8"?>
-<w:numbering xmlns:wpc="http://schemas.microsoft.com/office/word/2010/wordprocessingCanvas" xmlns:cx="http://schemas.microsoft.com/office/drawing/2014/chartex" xmlns:cx1="http://schemas.microsoft.com/office/drawing/2015/9/8/chartex" xmlns:cx2="http://schemas.microsoft.com/office/drawing/2015/10/21/chartex" xmlns:cx3="http://schemas.microsoft.com/office/drawing/2016/5/9/chartex" xmlns:cx4="http://schemas.microsoft.com/office/drawing/2016/5/10/chartex" xmlns:cx5="http://schemas.microsoft.com/office/drawing/2016/5/11/chartex" xmlns:cx6="http://schemas.microsoft.com/office/drawing/2016/5/12/chartex" xmlns:cx7="http://schemas.microsoft.com/office/drawing/2016/5/13/chartex" xmlns:cx8="http://schemas.microsoft.com/office/drawing/2016/5/14/chartex" xmlns:mc="http://schemas.openxmlformats.org/markup-compatibility/2006" xmlns:aink="http://schemas.microsoft.com/office/drawing/2016/ink" xmlns:am3d="http://schemas.microsoft.com/office/drawing/2017/model3d" xmlns:o="urn:schemas-microsoft-com:office:office" xmlns:r="http://schemas.openxmlformats.org/officeDocument/2006/relationships" xmlns:m="http://schemas.openxmlformats.org/officeDocument/2006/math" xmlns:v="urn:schemas-microsoft-com:vml" xmlns:wp14="http://schemas.microsoft.com/office/word/2010/wordprocessingDrawing" xmlns:wp="http://schemas.openxmlformats.org/drawingml/2006/wordprocessingDrawing" xmlns:w10="urn:schemas-microsoft-com:office:word" xmlns:w="http://schemas.openxmlformats.org/wordprocessingml/2006/main" xmlns:w14="http://schemas.microsoft.com/office/word/2010/wordml" xmlns:w15="http://schemas.microsoft.com/office/word/2012/wordml" xmlns:w16cex="http://schemas.microsoft.com/office/word/2018/wordml/cex" xmlns:w16cid="http://schemas.microsoft.com/office/word/2016/wordml/cid" xmlns:w16="http://schemas.microsoft.com/office/word/2018/wordml" xmlns:w16sdtdh="http://schemas.microsoft.com/office/word/2020/wordml/sdtdatahash" xmlns:w16se="http://schemas.microsoft.com/office/word/2015/wordml/symex" xmlns:wpg="http://schemas.microsoft.com/office/word/2010/wordprocessingGroup" xmlns:wpi="http://schemas.microsoft.com/office/word/2010/wordprocessingInk" xmlns:wne="http://schemas.microsoft.com/office/word/2006/wordml" xmlns:wps="http://schemas.microsoft.com/office/word/2010/wordprocessingShape" mc:Ignorable="w14 w15 w16se w16cid w16 w16cex w16sdtdh wp14">
+<w:numbering xmlns:wpc="http://schemas.microsoft.com/office/word/2010/wordprocessingCanvas" xmlns:cx="http://schemas.microsoft.com/office/drawing/2014/chartex" xmlns:cx1="http://schemas.microsoft.com/office/drawing/2015/9/8/chartex" xmlns:cx2="http://schemas.microsoft.com/office/drawing/2015/10/21/chartex" xmlns:cx3="http://schemas.microsoft.com/office/drawing/2016/5/9/chartex" xmlns:cx4="http://schemas.microsoft.com/office/drawing/2016/5/10/chartex" xmlns:cx5="http://schemas.microsoft.com/office/drawing/2016/5/11/chartex" xmlns:cx6="http://schemas.microsoft.com/office/drawing/2016/5/12/chartex" xmlns:cx7="http://schemas.microsoft.com/office/drawing/2016/5/13/chartex" xmlns:cx8="http://schemas.microsoft.com/office/drawing/2016/5/14/chartex" xmlns:mc="http://schemas.openxmlformats.org/markup-compatibility/2006" xmlns:aink="http://schemas.microsoft.com/office/drawing/2016/ink" xmlns:am3d="http://schemas.microsoft.com/office/drawing/2017/model3d" xmlns:o="urn:schemas-microsoft-com:office:office" xmlns:oel="http://schemas.microsoft.com/office/2019/extlst" xmlns:r="http://schemas.openxmlformats.org/officeDocument/2006/relationships" xmlns:m="http://schemas.openxmlformats.org/officeDocument/2006/math" xmlns:v="urn:schemas-microsoft-com:vml" xmlns:wp14="http://schemas.microsoft.com/office/word/2010/wordprocessingDrawing" xmlns:wp="http://schemas.openxmlformats.org/drawingml/2006/wordprocessingDrawing" xmlns:w10="urn:schemas-microsoft-com:office:word" xmlns:w="http://schemas.openxmlformats.org/wordprocessingml/2006/main" xmlns:w14="http://schemas.microsoft.com/office/word/2010/wordml" xmlns:w15="http://schemas.microsoft.com/office/word/2012/wordml" xmlns:w16cex="http://schemas.microsoft.com/office/word/2018/wordml/cex" xmlns:w16cid="http://schemas.microsoft.com/office/word/2016/wordml/cid" xmlns:w16="http://schemas.microsoft.com/office/word/2018/wordml" xmlns:w16du="http://schemas.microsoft.com/office/word/2023/wordml/word16du" xmlns:w16sdtdh="http://schemas.microsoft.com/office/word/2020/wordml/sdtdatahash" xmlns:w16sdtfl="http://schemas.microsoft.com/office/word/2024/wordml/sdtformatlock" xmlns:w16se="http://schemas.microsoft.com/office/word/2015/wordml/symex" xmlns:wpg="http://schemas.microsoft.com/office/word/2010/wordprocessingGroup" xmlns:wpi="http://schemas.microsoft.com/office/word/2010/wordprocessingInk" xmlns:wne="http://schemas.microsoft.com/office/word/2006/wordml" xmlns:wps="http://schemas.microsoft.com/office/word/2010/wordprocessingShape" mc:Ignorable="w14 w15 w16se w16cid w16 w16cex w16sdtdh w16sdtfl w16du wp14">
   <w:abstractNum w:abstractNumId="0" w15:restartNumberingAfterBreak="0">
     <w:nsid w:val="033A6E4A"/>
     <w:multiLevelType w:val="hybridMultilevel"/>
@@ -7230,80 +7154,80 @@
       </w:pPr>
     </w:lvl>
   </w:abstractNum>
-  <w:num w:numId="1">
+  <w:num w:numId="1" w16cid:durableId="949165511">
     <w:abstractNumId w:val="5"/>
   </w:num>
-  <w:num w:numId="2">
+  <w:num w:numId="2" w16cid:durableId="1411123462">
     <w:abstractNumId w:val="10"/>
   </w:num>
-  <w:num w:numId="3">
+  <w:num w:numId="3" w16cid:durableId="1145781152">
     <w:abstractNumId w:val="12"/>
   </w:num>
-  <w:num w:numId="4">
+  <w:num w:numId="4" w16cid:durableId="2036076698">
     <w:abstractNumId w:val="2"/>
   </w:num>
-  <w:num w:numId="5">
+  <w:num w:numId="5" w16cid:durableId="494685725">
     <w:abstractNumId w:val="13"/>
   </w:num>
-  <w:num w:numId="6">
+  <w:num w:numId="6" w16cid:durableId="662855873">
     <w:abstractNumId w:val="3"/>
   </w:num>
-  <w:num w:numId="7">
+  <w:num w:numId="7" w16cid:durableId="185679651">
     <w:abstractNumId w:val="22"/>
   </w:num>
-  <w:num w:numId="8">
+  <w:num w:numId="8" w16cid:durableId="563948092">
     <w:abstractNumId w:val="8"/>
   </w:num>
-  <w:num w:numId="9">
+  <w:num w:numId="9" w16cid:durableId="1584677569">
     <w:abstractNumId w:val="4"/>
   </w:num>
-  <w:num w:numId="10">
+  <w:num w:numId="10" w16cid:durableId="745997420">
     <w:abstractNumId w:val="11"/>
   </w:num>
-  <w:num w:numId="11">
+  <w:num w:numId="11" w16cid:durableId="1992445612">
     <w:abstractNumId w:val="1"/>
   </w:num>
-  <w:num w:numId="12">
+  <w:num w:numId="12" w16cid:durableId="30419653">
     <w:abstractNumId w:val="9"/>
   </w:num>
-  <w:num w:numId="13">
+  <w:num w:numId="13" w16cid:durableId="1910382580">
     <w:abstractNumId w:val="7"/>
   </w:num>
-  <w:num w:numId="14">
+  <w:num w:numId="14" w16cid:durableId="1309047319">
     <w:abstractNumId w:val="6"/>
   </w:num>
-  <w:num w:numId="15">
+  <w:num w:numId="15" w16cid:durableId="163208217">
     <w:abstractNumId w:val="21"/>
   </w:num>
-  <w:num w:numId="16">
+  <w:num w:numId="16" w16cid:durableId="1790978102">
     <w:abstractNumId w:val="20"/>
   </w:num>
-  <w:num w:numId="17">
+  <w:num w:numId="17" w16cid:durableId="399601409">
     <w:abstractNumId w:val="14"/>
   </w:num>
-  <w:num w:numId="18">
+  <w:num w:numId="18" w16cid:durableId="1553879127">
     <w:abstractNumId w:val="17"/>
   </w:num>
-  <w:num w:numId="19">
+  <w:num w:numId="19" w16cid:durableId="1279220607">
     <w:abstractNumId w:val="0"/>
   </w:num>
-  <w:num w:numId="20">
+  <w:num w:numId="20" w16cid:durableId="802500729">
     <w:abstractNumId w:val="15"/>
   </w:num>
-  <w:num w:numId="21">
+  <w:num w:numId="21" w16cid:durableId="203759702">
     <w:abstractNumId w:val="16"/>
   </w:num>
-  <w:num w:numId="22">
+  <w:num w:numId="22" w16cid:durableId="1860467001">
     <w:abstractNumId w:val="19"/>
   </w:num>
-  <w:num w:numId="23">
+  <w:num w:numId="23" w16cid:durableId="481044228">
     <w:abstractNumId w:val="18"/>
   </w:num>
 </w:numbering>
 </file>
 
 <file path=word/styles.xml><?xml version="1.0" encoding="utf-8"?>
-<w:styles xmlns:mc="http://schemas.openxmlformats.org/markup-compatibility/2006" xmlns:r="http://schemas.openxmlformats.org/officeDocument/2006/relationships" xmlns:w="http://schemas.openxmlformats.org/wordprocessingml/2006/main" xmlns:w14="http://schemas.microsoft.com/office/word/2010/wordml" xmlns:w15="http://schemas.microsoft.com/office/word/2012/wordml" xmlns:w16cex="http://schemas.microsoft.com/office/word/2018/wordml/cex" xmlns:w16cid="http://schemas.microsoft.com/office/word/2016/wordml/cid" xmlns:w16="http://schemas.microsoft.com/office/word/2018/wordml" xmlns:w16sdtdh="http://schemas.microsoft.com/office/word/2020/wordml/sdtdatahash" xmlns:w16se="http://schemas.microsoft.com/office/word/2015/wordml/symex" mc:Ignorable="w14 w15 w16se w16cid w16 w16cex w16sdtdh">
+<w:styles xmlns:mc="http://schemas.openxmlformats.org/markup-compatibility/2006" xmlns:r="http://schemas.openxmlformats.org/officeDocument/2006/relationships" xmlns:w="http://schemas.openxmlformats.org/wordprocessingml/2006/main" xmlns:w14="http://schemas.microsoft.com/office/word/2010/wordml" xmlns:w15="http://schemas.microsoft.com/office/word/2012/wordml" xmlns:w16cex="http://schemas.microsoft.com/office/word/2018/wordml/cex" xmlns:w16cid="http://schemas.microsoft.com/office/word/2016/wordml/cid" xmlns:w16="http://schemas.microsoft.com/office/word/2018/wordml" xmlns:w16du="http://schemas.microsoft.com/office/word/2023/wordml/word16du" xmlns:w16sdtdh="http://schemas.microsoft.com/office/word/2020/wordml/sdtdatahash" xmlns:w16sdtfl="http://schemas.microsoft.com/office/word/2024/wordml/sdtformatlock" xmlns:w16se="http://schemas.microsoft.com/office/word/2015/wordml/symex" mc:Ignorable="w14 w15 w16se w16cid w16 w16cex w16sdtdh w16sdtfl w16du">
   <w:docDefaults>
     <w:rPrDefault>
       <w:rPr>

</xml_diff>